<commit_message>
Temporäre Datei von docx entfernt
</commit_message>
<xml_diff>
--- a/docs/guide-extern.docx
+++ b/docs/guide-extern.docx
@@ -6,7 +6,7 @@
       <w:pPr>
         <w:pStyle w:val="berschrift1"/>
       </w:pPr>
-      <w:bookmarkStart w:id="0" w:name="_Toc243907435"/>
+      <w:bookmarkStart w:id="0" w:name="_Toc243992050"/>
       <w:r>
         <w:t>Inhalt</w:t>
       </w:r>
@@ -57,7 +57,7 @@
           <w:r>
             <w:fldChar w:fldCharType="separate"/>
           </w:r>
-          <w:hyperlink w:anchor="_Toc243907435" w:history="1">
+          <w:hyperlink w:anchor="_Toc243992050" w:history="1">
             <w:r>
               <w:rPr>
                 <w:rStyle w:val="Hyperlink"/>
@@ -84,7 +84,7 @@
                 <w:noProof/>
                 <w:webHidden/>
               </w:rPr>
-              <w:instrText xml:space="preserve"> PAGEREF _Toc243907435 \h </w:instrText>
+              <w:instrText xml:space="preserve"> PAGEREF _Toc243992050 \h </w:instrText>
             </w:r>
             <w:r>
               <w:rPr>
@@ -129,13 +129,13 @@
               <w:lang w:eastAsia="de-DE"/>
             </w:rPr>
           </w:pPr>
-          <w:hyperlink w:anchor="_Toc243907436" w:history="1">
+          <w:hyperlink w:anchor="_Toc243992051" w:history="1">
             <w:r>
               <w:rPr>
                 <w:rStyle w:val="Hyperlink"/>
                 <w:noProof/>
               </w:rPr>
-              <w:t>Externer Service</w:t>
+              <w:t>Programmführung und Informationen</w:t>
             </w:r>
             <w:r>
               <w:rPr>
@@ -156,7 +156,7 @@
                 <w:noProof/>
                 <w:webHidden/>
               </w:rPr>
-              <w:instrText xml:space="preserve"> PAGEREF _Toc243907436 \h </w:instrText>
+              <w:instrText xml:space="preserve"> PAGEREF _Toc243992051 \h </w:instrText>
             </w:r>
             <w:r>
               <w:rPr>
@@ -201,13 +201,13 @@
               <w:lang w:eastAsia="de-DE"/>
             </w:rPr>
           </w:pPr>
-          <w:hyperlink w:anchor="_Toc243907437" w:history="1">
+          <w:hyperlink w:anchor="_Toc243992052" w:history="1">
             <w:r>
               <w:rPr>
                 <w:rStyle w:val="Hyperlink"/>
                 <w:noProof/>
               </w:rPr>
-              <w:t>Service erstellen</w:t>
+              <w:t>Bearbeiten von Arbeitsgängen</w:t>
             </w:r>
             <w:r>
               <w:rPr>
@@ -228,7 +228,7 @@
                 <w:noProof/>
                 <w:webHidden/>
               </w:rPr>
-              <w:instrText xml:space="preserve"> PAGEREF _Toc243907437 \h </w:instrText>
+              <w:instrText xml:space="preserve"> PAGEREF _Toc243992052 \h </w:instrText>
             </w:r>
             <w:r>
               <w:rPr>
@@ -273,13 +273,13 @@
               <w:lang w:eastAsia="de-DE"/>
             </w:rPr>
           </w:pPr>
-          <w:hyperlink w:anchor="_Toc243907438" w:history="1">
+          <w:hyperlink w:anchor="_Toc243992053" w:history="1">
             <w:r>
               <w:rPr>
                 <w:rStyle w:val="Hyperlink"/>
                 <w:noProof/>
               </w:rPr>
-              <w:t>Externen Service vorbereiten (Im Haus)</w:t>
+              <w:t>Bearbeiten von Arbeitsschritten</w:t>
             </w:r>
             <w:r>
               <w:rPr>
@@ -300,7 +300,7 @@
                 <w:noProof/>
                 <w:webHidden/>
               </w:rPr>
-              <w:instrText xml:space="preserve"> PAGEREF _Toc243907438 \h </w:instrText>
+              <w:instrText xml:space="preserve"> PAGEREF _Toc243992053 \h </w:instrText>
             </w:r>
             <w:r>
               <w:rPr>
@@ -320,7 +320,79 @@
                 <w:noProof/>
                 <w:webHidden/>
               </w:rPr>
-              <w:t>4</w:t>
+              <w:t>2</w:t>
+            </w:r>
+            <w:r>
+              <w:rPr>
+                <w:noProof/>
+                <w:webHidden/>
+              </w:rPr>
+              <w:fldChar w:fldCharType="end"/>
+            </w:r>
+          </w:hyperlink>
+        </w:p>
+        <w:p>
+          <w:pPr>
+            <w:pStyle w:val="Verzeichnis1"/>
+            <w:tabs>
+              <w:tab w:val="right" w:leader="dot" w:pos="9062"/>
+            </w:tabs>
+            <w:rPr>
+              <w:rFonts w:eastAsiaTheme="minorEastAsia"/>
+              <w:noProof/>
+              <w:sz w:val="24"/>
+              <w:szCs w:val="24"/>
+              <w:lang w:eastAsia="de-DE"/>
+            </w:rPr>
+          </w:pPr>
+          <w:hyperlink w:anchor="_Toc243992054" w:history="1">
+            <w:r>
+              <w:rPr>
+                <w:rStyle w:val="Hyperlink"/>
+                <w:noProof/>
+              </w:rPr>
+              <w:t>Externer Service</w:t>
+            </w:r>
+            <w:r>
+              <w:rPr>
+                <w:noProof/>
+                <w:webHidden/>
+              </w:rPr>
+              <w:tab/>
+            </w:r>
+            <w:r>
+              <w:rPr>
+                <w:noProof/>
+                <w:webHidden/>
+              </w:rPr>
+              <w:fldChar w:fldCharType="begin"/>
+            </w:r>
+            <w:r>
+              <w:rPr>
+                <w:noProof/>
+                <w:webHidden/>
+              </w:rPr>
+              <w:instrText xml:space="preserve"> PAGEREF _Toc243992054 \h </w:instrText>
+            </w:r>
+            <w:r>
+              <w:rPr>
+                <w:noProof/>
+                <w:webHidden/>
+              </w:rPr>
+            </w:r>
+            <w:r>
+              <w:rPr>
+                <w:noProof/>
+                <w:webHidden/>
+              </w:rPr>
+              <w:fldChar w:fldCharType="separate"/>
+            </w:r>
+            <w:r>
+              <w:rPr>
+                <w:noProof/>
+                <w:webHidden/>
+              </w:rPr>
+              <w:t>3</w:t>
             </w:r>
             <w:r>
               <w:rPr>
@@ -345,12 +417,156 @@
               <w:lang w:eastAsia="de-DE"/>
             </w:rPr>
           </w:pPr>
-          <w:hyperlink w:anchor="_Toc243907439" w:history="1">
+          <w:hyperlink w:anchor="_Toc243992055" w:history="1">
             <w:r>
               <w:rPr>
                 <w:rStyle w:val="Hyperlink"/>
                 <w:noProof/>
               </w:rPr>
+              <w:t>Service erstellen</w:t>
+            </w:r>
+            <w:r>
+              <w:rPr>
+                <w:noProof/>
+                <w:webHidden/>
+              </w:rPr>
+              <w:tab/>
+            </w:r>
+            <w:r>
+              <w:rPr>
+                <w:noProof/>
+                <w:webHidden/>
+              </w:rPr>
+              <w:fldChar w:fldCharType="begin"/>
+            </w:r>
+            <w:r>
+              <w:rPr>
+                <w:noProof/>
+                <w:webHidden/>
+              </w:rPr>
+              <w:instrText xml:space="preserve"> PAGEREF _Toc243992055 \h </w:instrText>
+            </w:r>
+            <w:r>
+              <w:rPr>
+                <w:noProof/>
+                <w:webHidden/>
+              </w:rPr>
+            </w:r>
+            <w:r>
+              <w:rPr>
+                <w:noProof/>
+                <w:webHidden/>
+              </w:rPr>
+              <w:fldChar w:fldCharType="separate"/>
+            </w:r>
+            <w:r>
+              <w:rPr>
+                <w:noProof/>
+                <w:webHidden/>
+              </w:rPr>
+              <w:t>3</w:t>
+            </w:r>
+            <w:r>
+              <w:rPr>
+                <w:noProof/>
+                <w:webHidden/>
+              </w:rPr>
+              <w:fldChar w:fldCharType="end"/>
+            </w:r>
+          </w:hyperlink>
+        </w:p>
+        <w:p>
+          <w:pPr>
+            <w:pStyle w:val="Verzeichnis2"/>
+            <w:tabs>
+              <w:tab w:val="right" w:leader="dot" w:pos="9062"/>
+            </w:tabs>
+            <w:rPr>
+              <w:rFonts w:eastAsiaTheme="minorEastAsia"/>
+              <w:noProof/>
+              <w:sz w:val="24"/>
+              <w:szCs w:val="24"/>
+              <w:lang w:eastAsia="de-DE"/>
+            </w:rPr>
+          </w:pPr>
+          <w:hyperlink w:anchor="_Toc243992056" w:history="1">
+            <w:r>
+              <w:rPr>
+                <w:rStyle w:val="Hyperlink"/>
+                <w:noProof/>
+              </w:rPr>
+              <w:t>Externen Service vorbereiten (Im Haus)</w:t>
+            </w:r>
+            <w:r>
+              <w:rPr>
+                <w:noProof/>
+                <w:webHidden/>
+              </w:rPr>
+              <w:tab/>
+            </w:r>
+            <w:r>
+              <w:rPr>
+                <w:noProof/>
+                <w:webHidden/>
+              </w:rPr>
+              <w:fldChar w:fldCharType="begin"/>
+            </w:r>
+            <w:r>
+              <w:rPr>
+                <w:noProof/>
+                <w:webHidden/>
+              </w:rPr>
+              <w:instrText xml:space="preserve"> PAGEREF _Toc243992056 \h </w:instrText>
+            </w:r>
+            <w:r>
+              <w:rPr>
+                <w:noProof/>
+                <w:webHidden/>
+              </w:rPr>
+            </w:r>
+            <w:r>
+              <w:rPr>
+                <w:noProof/>
+                <w:webHidden/>
+              </w:rPr>
+              <w:fldChar w:fldCharType="separate"/>
+            </w:r>
+            <w:r>
+              <w:rPr>
+                <w:noProof/>
+                <w:webHidden/>
+              </w:rPr>
+              <w:t>5</w:t>
+            </w:r>
+            <w:r>
+              <w:rPr>
+                <w:noProof/>
+                <w:webHidden/>
+              </w:rPr>
+              <w:fldChar w:fldCharType="end"/>
+            </w:r>
+          </w:hyperlink>
+        </w:p>
+        <w:p>
+          <w:pPr>
+            <w:pStyle w:val="Verzeichnis2"/>
+            <w:tabs>
+              <w:tab w:val="right" w:leader="dot" w:pos="9062"/>
+            </w:tabs>
+            <w:rPr>
+              <w:rFonts w:eastAsiaTheme="minorEastAsia"/>
+              <w:noProof/>
+              <w:sz w:val="24"/>
+              <w:szCs w:val="24"/>
+              <w:lang w:eastAsia="de-DE"/>
+            </w:rPr>
+          </w:pPr>
+          <w:hyperlink w:anchor="_Toc243992057" w:history="1">
+            <w:r>
+              <w:rPr>
+                <w:rStyle w:val="Hyperlink"/>
+                <w:noProof/>
+              </w:rPr>
               <w:t>Arbeiten beim Kunden</w:t>
             </w:r>
             <w:r>
@@ -372,7 +588,7 @@
                 <w:noProof/>
                 <w:webHidden/>
               </w:rPr>
-              <w:instrText xml:space="preserve"> PAGEREF _Toc243907439 \h </w:instrText>
+              <w:instrText xml:space="preserve"> PAGEREF _Toc243992057 \h </w:instrText>
             </w:r>
             <w:r>
               <w:rPr>
@@ -392,7 +608,349 @@
                 <w:noProof/>
                 <w:webHidden/>
               </w:rPr>
-              <w:t>5</w:t>
+              <w:t>6</w:t>
+            </w:r>
+            <w:r>
+              <w:rPr>
+                <w:noProof/>
+                <w:webHidden/>
+              </w:rPr>
+              <w:fldChar w:fldCharType="end"/>
+            </w:r>
+          </w:hyperlink>
+        </w:p>
+        <w:p>
+          <w:pPr>
+            <w:pStyle w:val="Verzeichnis3"/>
+            <w:tabs>
+              <w:tab w:val="left" w:pos="960"/>
+              <w:tab w:val="right" w:leader="dot" w:pos="9062"/>
+            </w:tabs>
+            <w:rPr>
+              <w:rFonts w:eastAsiaTheme="minorEastAsia"/>
+              <w:noProof/>
+              <w:sz w:val="24"/>
+              <w:szCs w:val="24"/>
+              <w:lang w:eastAsia="de-DE"/>
+            </w:rPr>
+          </w:pPr>
+          <w:hyperlink w:anchor="_Toc243992058" w:history="1">
+            <w:r>
+              <w:rPr>
+                <w:rStyle w:val="Hyperlink"/>
+                <w:noProof/>
+              </w:rPr>
+              <w:t>1.</w:t>
+            </w:r>
+            <w:r>
+              <w:rPr>
+                <w:rFonts w:eastAsiaTheme="minorEastAsia"/>
+                <w:noProof/>
+                <w:sz w:val="24"/>
+                <w:szCs w:val="24"/>
+                <w:lang w:eastAsia="de-DE"/>
+              </w:rPr>
+              <w:tab/>
+            </w:r>
+            <w:r>
+              <w:rPr>
+                <w:rStyle w:val="Hyperlink"/>
+                <w:noProof/>
+              </w:rPr>
+              <w:t>Bestandsaufnahme</w:t>
+            </w:r>
+            <w:r>
+              <w:rPr>
+                <w:noProof/>
+                <w:webHidden/>
+              </w:rPr>
+              <w:tab/>
+            </w:r>
+            <w:r>
+              <w:rPr>
+                <w:noProof/>
+                <w:webHidden/>
+              </w:rPr>
+              <w:fldChar w:fldCharType="begin"/>
+            </w:r>
+            <w:r>
+              <w:rPr>
+                <w:noProof/>
+                <w:webHidden/>
+              </w:rPr>
+              <w:instrText xml:space="preserve"> PAGEREF _Toc243992058 \h </w:instrText>
+            </w:r>
+            <w:r>
+              <w:rPr>
+                <w:noProof/>
+                <w:webHidden/>
+              </w:rPr>
+            </w:r>
+            <w:r>
+              <w:rPr>
+                <w:noProof/>
+                <w:webHidden/>
+              </w:rPr>
+              <w:fldChar w:fldCharType="separate"/>
+            </w:r>
+            <w:r>
+              <w:rPr>
+                <w:noProof/>
+                <w:webHidden/>
+              </w:rPr>
+              <w:t>6</w:t>
+            </w:r>
+            <w:r>
+              <w:rPr>
+                <w:noProof/>
+                <w:webHidden/>
+              </w:rPr>
+              <w:fldChar w:fldCharType="end"/>
+            </w:r>
+          </w:hyperlink>
+        </w:p>
+        <w:p>
+          <w:pPr>
+            <w:pStyle w:val="Verzeichnis3"/>
+            <w:tabs>
+              <w:tab w:val="left" w:pos="960"/>
+              <w:tab w:val="right" w:leader="dot" w:pos="9062"/>
+            </w:tabs>
+            <w:rPr>
+              <w:rFonts w:eastAsiaTheme="minorEastAsia"/>
+              <w:noProof/>
+              <w:sz w:val="24"/>
+              <w:szCs w:val="24"/>
+              <w:lang w:eastAsia="de-DE"/>
+            </w:rPr>
+          </w:pPr>
+          <w:hyperlink w:anchor="_Toc243992059" w:history="1">
+            <w:r>
+              <w:rPr>
+                <w:rStyle w:val="Hyperlink"/>
+                <w:noProof/>
+              </w:rPr>
+              <w:t>2.</w:t>
+            </w:r>
+            <w:r>
+              <w:rPr>
+                <w:rFonts w:eastAsiaTheme="minorEastAsia"/>
+                <w:noProof/>
+                <w:sz w:val="24"/>
+                <w:szCs w:val="24"/>
+                <w:lang w:eastAsia="de-DE"/>
+              </w:rPr>
+              <w:tab/>
+            </w:r>
+            <w:r>
+              <w:rPr>
+                <w:rStyle w:val="Hyperlink"/>
+                <w:noProof/>
+              </w:rPr>
+              <w:t>Messungen und Wartung durchführen</w:t>
+            </w:r>
+            <w:r>
+              <w:rPr>
+                <w:noProof/>
+                <w:webHidden/>
+              </w:rPr>
+              <w:tab/>
+            </w:r>
+            <w:r>
+              <w:rPr>
+                <w:noProof/>
+                <w:webHidden/>
+              </w:rPr>
+              <w:fldChar w:fldCharType="begin"/>
+            </w:r>
+            <w:r>
+              <w:rPr>
+                <w:noProof/>
+                <w:webHidden/>
+              </w:rPr>
+              <w:instrText xml:space="preserve"> PAGEREF _Toc243992059 \h </w:instrText>
+            </w:r>
+            <w:r>
+              <w:rPr>
+                <w:noProof/>
+                <w:webHidden/>
+              </w:rPr>
+            </w:r>
+            <w:r>
+              <w:rPr>
+                <w:noProof/>
+                <w:webHidden/>
+              </w:rPr>
+              <w:fldChar w:fldCharType="separate"/>
+            </w:r>
+            <w:r>
+              <w:rPr>
+                <w:noProof/>
+                <w:webHidden/>
+              </w:rPr>
+              <w:t>7</w:t>
+            </w:r>
+            <w:r>
+              <w:rPr>
+                <w:noProof/>
+                <w:webHidden/>
+              </w:rPr>
+              <w:fldChar w:fldCharType="end"/>
+            </w:r>
+          </w:hyperlink>
+        </w:p>
+        <w:p>
+          <w:pPr>
+            <w:pStyle w:val="Verzeichnis3"/>
+            <w:tabs>
+              <w:tab w:val="left" w:pos="960"/>
+              <w:tab w:val="right" w:leader="dot" w:pos="9062"/>
+            </w:tabs>
+            <w:rPr>
+              <w:rFonts w:eastAsiaTheme="minorEastAsia"/>
+              <w:noProof/>
+              <w:sz w:val="24"/>
+              <w:szCs w:val="24"/>
+              <w:lang w:eastAsia="de-DE"/>
+            </w:rPr>
+          </w:pPr>
+          <w:hyperlink w:anchor="_Toc243992060" w:history="1">
+            <w:r>
+              <w:rPr>
+                <w:rStyle w:val="Hyperlink"/>
+                <w:noProof/>
+              </w:rPr>
+              <w:t>3.</w:t>
+            </w:r>
+            <w:r>
+              <w:rPr>
+                <w:rFonts w:eastAsiaTheme="minorEastAsia"/>
+                <w:noProof/>
+                <w:sz w:val="24"/>
+                <w:szCs w:val="24"/>
+                <w:lang w:eastAsia="de-DE"/>
+              </w:rPr>
+              <w:tab/>
+            </w:r>
+            <w:r>
+              <w:rPr>
+                <w:rStyle w:val="Hyperlink"/>
+                <w:noProof/>
+              </w:rPr>
+              <w:t>Übergabe an den Kunden</w:t>
+            </w:r>
+            <w:r>
+              <w:rPr>
+                <w:noProof/>
+                <w:webHidden/>
+              </w:rPr>
+              <w:tab/>
+            </w:r>
+            <w:r>
+              <w:rPr>
+                <w:noProof/>
+                <w:webHidden/>
+              </w:rPr>
+              <w:fldChar w:fldCharType="begin"/>
+            </w:r>
+            <w:r>
+              <w:rPr>
+                <w:noProof/>
+                <w:webHidden/>
+              </w:rPr>
+              <w:instrText xml:space="preserve"> PAGEREF _Toc243992060 \h </w:instrText>
+            </w:r>
+            <w:r>
+              <w:rPr>
+                <w:noProof/>
+                <w:webHidden/>
+              </w:rPr>
+            </w:r>
+            <w:r>
+              <w:rPr>
+                <w:noProof/>
+                <w:webHidden/>
+              </w:rPr>
+              <w:fldChar w:fldCharType="separate"/>
+            </w:r>
+            <w:r>
+              <w:rPr>
+                <w:noProof/>
+                <w:webHidden/>
+              </w:rPr>
+              <w:t>8</w:t>
+            </w:r>
+            <w:r>
+              <w:rPr>
+                <w:noProof/>
+                <w:webHidden/>
+              </w:rPr>
+              <w:fldChar w:fldCharType="end"/>
+            </w:r>
+          </w:hyperlink>
+        </w:p>
+        <w:p>
+          <w:pPr>
+            <w:pStyle w:val="Verzeichnis2"/>
+            <w:tabs>
+              <w:tab w:val="right" w:leader="dot" w:pos="9062"/>
+            </w:tabs>
+            <w:rPr>
+              <w:rFonts w:eastAsiaTheme="minorEastAsia"/>
+              <w:noProof/>
+              <w:sz w:val="24"/>
+              <w:szCs w:val="24"/>
+              <w:lang w:eastAsia="de-DE"/>
+            </w:rPr>
+          </w:pPr>
+          <w:hyperlink w:anchor="_Toc243992061" w:history="1">
+            <w:r>
+              <w:rPr>
+                <w:rStyle w:val="Hyperlink"/>
+                <w:noProof/>
+              </w:rPr>
+              <w:t>Service abschließen (Im Haus)</w:t>
+            </w:r>
+            <w:r>
+              <w:rPr>
+                <w:noProof/>
+                <w:webHidden/>
+              </w:rPr>
+              <w:tab/>
+            </w:r>
+            <w:r>
+              <w:rPr>
+                <w:noProof/>
+                <w:webHidden/>
+              </w:rPr>
+              <w:fldChar w:fldCharType="begin"/>
+            </w:r>
+            <w:r>
+              <w:rPr>
+                <w:noProof/>
+                <w:webHidden/>
+              </w:rPr>
+              <w:instrText xml:space="preserve"> PAGEREF _Toc243992061 \h </w:instrText>
+            </w:r>
+            <w:r>
+              <w:rPr>
+                <w:noProof/>
+                <w:webHidden/>
+              </w:rPr>
+            </w:r>
+            <w:r>
+              <w:rPr>
+                <w:noProof/>
+                <w:webHidden/>
+              </w:rPr>
+              <w:fldChar w:fldCharType="separate"/>
+            </w:r>
+            <w:r>
+              <w:rPr>
+                <w:noProof/>
+                <w:webHidden/>
+              </w:rPr>
+              <w:t>12</w:t>
             </w:r>
             <w:r>
               <w:rPr>
@@ -431,20 +989,23 @@
         <w:pStyle w:val="berschrift1"/>
       </w:pPr>
       <w:bookmarkStart w:id="1" w:name="_Installation"/>
-      <w:bookmarkStart w:id="2" w:name="_Toc243907436"/>
+      <w:bookmarkStart w:id="2" w:name="_Toc243992051"/>
       <w:bookmarkEnd w:id="1"/>
       <w:r>
         <w:lastRenderedPageBreak/>
         <w:t>Programmführung und Informationen</w:t>
       </w:r>
+      <w:bookmarkEnd w:id="2"/>
     </w:p>
     <w:p>
       <w:pPr>
         <w:pStyle w:val="berschrift2"/>
       </w:pPr>
+      <w:bookmarkStart w:id="3" w:name="_Toc243992052"/>
       <w:r>
         <w:t>Bearbeiten von Arbeitsgängen</w:t>
       </w:r>
+      <w:bookmarkEnd w:id="3"/>
     </w:p>
     <w:p>
       <w:pPr>
@@ -486,9 +1047,11 @@
       <w:pPr>
         <w:pStyle w:val="berschrift2"/>
       </w:pPr>
+      <w:bookmarkStart w:id="4" w:name="_Toc243992053"/>
       <w:r>
         <w:t>Bearbeiten von Arbeitsschritten</w:t>
       </w:r>
+      <w:bookmarkEnd w:id="4"/>
     </w:p>
     <w:p>
       <w:pPr>
@@ -677,7 +1240,15 @@
         </w:numPr>
       </w:pPr>
       <w:r>
-        <w:t>Zusätzliche tooltips werden angezeigt, sobald man sich mit der Maus über einem Aufgabenfeld befindet.</w:t>
+        <w:t xml:space="preserve">Zusätzliche </w:t>
+      </w:r>
+      <w:proofErr w:type="spellStart"/>
+      <w:r>
+        <w:t>tooltips</w:t>
+      </w:r>
+      <w:proofErr w:type="spellEnd"/>
+      <w:r>
+        <w:t xml:space="preserve"> werden angezeigt, sobald man sich mit der Maus über einem Aufgabenfeld befindet.</w:t>
       </w:r>
       <w:r>
         <w:br/>
@@ -729,11 +1300,12 @@
       <w:pPr>
         <w:pStyle w:val="berschrift1"/>
       </w:pPr>
+      <w:bookmarkStart w:id="5" w:name="_Toc243992054"/>
       <w:r>
         <w:lastRenderedPageBreak/>
         <w:t>Externer Service</w:t>
       </w:r>
-      <w:bookmarkEnd w:id="2"/>
+      <w:bookmarkEnd w:id="5"/>
     </w:p>
     <w:p>
       <w:r>
@@ -744,11 +1316,11 @@
       <w:pPr>
         <w:pStyle w:val="berschrift2"/>
       </w:pPr>
-      <w:bookmarkStart w:id="3" w:name="_Toc243907437"/>
+      <w:bookmarkStart w:id="6" w:name="_Toc243992055"/>
       <w:r>
         <w:t>Service erstellen</w:t>
       </w:r>
-      <w:bookmarkEnd w:id="3"/>
+      <w:bookmarkEnd w:id="6"/>
     </w:p>
     <w:p>
       <w:pPr>
@@ -975,12 +1547,12 @@
       <w:pPr>
         <w:pStyle w:val="berschrift2"/>
       </w:pPr>
-      <w:bookmarkStart w:id="4" w:name="_Toc243907438"/>
+      <w:bookmarkStart w:id="7" w:name="_Toc243992056"/>
       <w:r>
         <w:lastRenderedPageBreak/>
         <w:t>Externen Service vorbereiten (Im Haus)</w:t>
       </w:r>
-      <w:bookmarkEnd w:id="4"/>
+      <w:bookmarkEnd w:id="7"/>
     </w:p>
     <w:p>
       <w:pPr>
@@ -1172,11 +1744,11 @@
       <w:pPr>
         <w:pStyle w:val="berschrift2"/>
       </w:pPr>
-      <w:bookmarkStart w:id="5" w:name="_Toc243907439"/>
+      <w:bookmarkStart w:id="8" w:name="_Toc243992057"/>
       <w:r>
         <w:t>Arbeiten beim Kunden</w:t>
       </w:r>
-      <w:bookmarkEnd w:id="5"/>
+      <w:bookmarkEnd w:id="8"/>
     </w:p>
     <w:p>
       <w:pPr>
@@ -1186,9 +1758,11 @@
           <w:numId w:val="44"/>
         </w:numPr>
       </w:pPr>
+      <w:bookmarkStart w:id="9" w:name="_Toc243992058"/>
       <w:r>
         <w:t>Bestandsaufnahme</w:t>
       </w:r>
+      <w:bookmarkEnd w:id="9"/>
     </w:p>
     <w:p>
       <w:pPr>
@@ -1404,9 +1978,11 @@
           <w:numId w:val="44"/>
         </w:numPr>
       </w:pPr>
+      <w:bookmarkStart w:id="10" w:name="_Toc243992059"/>
       <w:r>
         <w:t>Messungen und Wartung durchführen</w:t>
       </w:r>
+      <w:bookmarkEnd w:id="10"/>
     </w:p>
     <w:p>
       <w:pPr>
@@ -1420,7 +1996,15 @@
         <w:t xml:space="preserve">Die weiteren Arbeitsgänge wie in „Bestandsaufnahme“ gewissenhaft ausfüllen, Arbeitszeit eintragen und fertigmelden bis </w:t>
       </w:r>
       <w:r>
-        <w:t xml:space="preserve">zum Punkt „Reader Info (Nach Service)“. Es müssen nur Felder ausgefüllt werden, welche auch wirklich erledigt wurden. Alle anderen einfach nicht bearbeiten, dann tauchen sie auch nicht auf </w:t>
+        <w:t xml:space="preserve">zum Punkt „Reader Info (Nach Service)“. Es müssen nur Felder ausgefüllt werden, welche auch wirklich erledigt wurden. Alle anderen </w:t>
+      </w:r>
+      <w:proofErr w:type="gramStart"/>
+      <w:r>
+        <w:t>einfach nicht</w:t>
+      </w:r>
+      <w:proofErr w:type="gramEnd"/>
+      <w:r>
+        <w:t xml:space="preserve"> bearbeiten, dann tauchen sie auch nicht auf </w:t>
       </w:r>
       <w:r>
         <w:lastRenderedPageBreak/>
@@ -1533,9 +2117,11 @@
           <w:numId w:val="44"/>
         </w:numPr>
       </w:pPr>
+      <w:bookmarkStart w:id="11" w:name="_Toc243992060"/>
       <w:r>
         <w:t>Übergabe an den Kunden</w:t>
       </w:r>
+      <w:bookmarkEnd w:id="11"/>
     </w:p>
     <w:p>
       <w:pPr>
@@ -1606,7 +2192,15 @@
       </w:pPr>
       <w:r>
         <w:lastRenderedPageBreak/>
-        <w:t>Unter „Checkliste“ auf „Record erstellen“ klicken und den Rekord-Export erstellen.</w:t>
+        <w:t>Unter „Checkliste“ auf „</w:t>
+      </w:r>
+      <w:proofErr w:type="spellStart"/>
+      <w:r>
+        <w:t>Record</w:t>
+      </w:r>
+      <w:proofErr w:type="spellEnd"/>
+      <w:r>
+        <w:t xml:space="preserve"> erstellen“ klicken und den Rekord-Export erstellen.</w:t>
       </w:r>
       <w:r>
         <w:br/>
@@ -1661,7 +2255,15 @@
         </w:numPr>
       </w:pPr>
       <w:r>
-        <w:t>Arbeitsgänge wählen, welche auf dem Ausdruck auftauchen sollen, ggf. die Reihenfolge ändern und Record erstellen.</w:t>
+        <w:t xml:space="preserve">Arbeitsgänge wählen, welche auf dem Ausdruck auftauchen sollen, ggf. die Reihenfolge ändern und </w:t>
+      </w:r>
+      <w:proofErr w:type="spellStart"/>
+      <w:r>
+        <w:t>Record</w:t>
+      </w:r>
+      <w:proofErr w:type="spellEnd"/>
+      <w:r>
+        <w:t xml:space="preserve"> erstellen.</w:t>
       </w:r>
       <w:r>
         <w:br/>
@@ -1717,8 +2319,13 @@
       </w:pPr>
       <w:r>
         <w:lastRenderedPageBreak/>
-        <w:t>Der Ausdruck öffnet sich im browser</w:t>
-      </w:r>
+        <w:t xml:space="preserve">Der Ausdruck öffnet sich im </w:t>
+      </w:r>
+      <w:proofErr w:type="spellStart"/>
+      <w:r>
+        <w:t>browser</w:t>
+      </w:r>
+      <w:proofErr w:type="spellEnd"/>
       <w:r>
         <w:br/>
       </w:r>
@@ -2012,7 +2619,15 @@
       </w:pPr>
       <w:r>
         <w:lastRenderedPageBreak/>
-        <w:t xml:space="preserve">Datei im Geräteordner (Lokal) speichern. Der Ordner kann direkt über den ServiceTracker </w:t>
+        <w:t xml:space="preserve">Datei im Geräteordner (Lokal) speichern. Der Ordner kann direkt über den </w:t>
+      </w:r>
+      <w:proofErr w:type="spellStart"/>
+      <w:r>
+        <w:t>ServiceTracker</w:t>
+      </w:r>
+      <w:proofErr w:type="spellEnd"/>
+      <w:r>
+        <w:t xml:space="preserve"> </w:t>
       </w:r>
       <w:r>
         <w:t xml:space="preserve">im Reader Filewalker </w:t>
@@ -2065,9 +2680,11 @@
       <w:pPr>
         <w:pStyle w:val="berschrift2"/>
       </w:pPr>
+      <w:bookmarkStart w:id="12" w:name="_Toc243992061"/>
       <w:r>
         <w:t>Service abschließen (Im Haus)</w:t>
       </w:r>
+      <w:bookmarkEnd w:id="12"/>
     </w:p>
     <w:p>
       <w:pPr>
@@ -2233,8 +2850,13 @@
     <w:r>
       <w:ptab w:relativeTo="margin" w:alignment="center" w:leader="none"/>
     </w:r>
+    <w:proofErr w:type="spellStart"/>
     <w:r>
-      <w:t>ServiceTracker Nutzeranleitung</w:t>
+      <w:t>ServiceTracker</w:t>
+    </w:r>
+    <w:proofErr w:type="spellEnd"/>
+    <w:r>
+      <w:t xml:space="preserve"> Nutzeranleitung</w:t>
     </w:r>
     <w:r>
       <w:ptab w:relativeTo="margin" w:alignment="right" w:leader="none"/>
@@ -2350,14 +2972,27 @@
     <w:pPr>
       <w:pStyle w:val="Kopfzeile"/>
     </w:pPr>
-    <w:fldSimple w:instr=" STYLEREF  &quot;Überschrift 1&quot;  \* MERGEFORMAT ">
-      <w:r>
-        <w:rPr>
-          <w:noProof/>
-        </w:rPr>
-        <w:t>Externer Service</w:t>
-      </w:r>
-    </w:fldSimple>
+    <w:r>
+      <w:fldChar w:fldCharType="begin"/>
+    </w:r>
+    <w:r>
+      <w:instrText xml:space="preserve"> STYLEREF  "Überschrift 1"  \* MERGEFORMAT </w:instrText>
+    </w:r>
+    <w:r>
+      <w:fldChar w:fldCharType="separate"/>
+    </w:r>
+    <w:r>
+      <w:rPr>
+        <w:noProof/>
+      </w:rPr>
+      <w:t>Inhalt</w:t>
+    </w:r>
+    <w:r>
+      <w:rPr>
+        <w:noProof/>
+      </w:rPr>
+      <w:fldChar w:fldCharType="end"/>
+    </w:r>
     <w:r>
       <w:tab/>
     </w:r>

</xml_diff>